<commit_message>
Anexo del caso de estudio Huellitas y su conexion con el material
Co-Authored-By: Claude Opus 5 <noreply@anthropic.com>
</commit_message>
<xml_diff>
--- a/Bases de Datos II/Clases/Clase 1 - Revision BD I y arranque VetCare/Taller PI - Clase 1 - VetCare.docx
+++ b/Bases de Datos II/Clases/Clase 1 - Revision BD I y arranque VetCare/Taller PI - Clase 1 - VetCare.docx
@@ -72,6 +72,189 @@
           <w:sz w:val="22"/>
         </w:rPr>
         <w:t>Hoy avanzamos el PI en: Arranque PI: dominio, alcance y borrador ER de VetCare DB</w:t>
+      </w:r>
+    </w:p>
+    <w:p>
+      <w:pPr>
+        <w:spacing w:after="120"/>
+      </w:pPr>
+      <w:r>
+        <w:rPr>
+          <w:rFonts w:ascii="Calibri" w:hAnsi="Calibri" w:eastAsia="Calibri"/>
+          <w:b/>
+          <w:color w:val="095292"/>
+          <w:sz w:val="24"/>
+        </w:rPr>
+        <w:t>0. El cliente: Clínica Veterinaria «Huellitas»</w:t>
+      </w:r>
+    </w:p>
+    <w:p>
+      <w:pPr>
+        <w:spacing w:after="120"/>
+      </w:pPr>
+      <w:r>
+        <w:rPr>
+          <w:rFonts w:ascii="Calibri" w:hAnsi="Calibri" w:eastAsia="Calibri"/>
+          <w:b w:val="0"/>
+          <w:color w:val="2B2B2B"/>
+          <w:sz w:val="22"/>
+        </w:rPr>
+        <w:t xml:space="preserve">Atiende unas </w:t>
+      </w:r>
+      <w:r>
+        <w:rPr>
+          <w:rFonts w:ascii="Calibri" w:hAnsi="Calibri" w:eastAsia="Calibri"/>
+          <w:b/>
+          <w:color w:val="2B2B2B"/>
+          <w:sz w:val="22"/>
+        </w:rPr>
+        <w:t>150 citas al día</w:t>
+      </w:r>
+      <w:r>
+        <w:rPr>
+          <w:rFonts w:ascii="Calibri" w:hAnsi="Calibri" w:eastAsia="Calibri"/>
+          <w:b w:val="0"/>
+          <w:color w:val="2B2B2B"/>
+          <w:sz w:val="22"/>
+        </w:rPr>
+        <w:t xml:space="preserve"> con </w:t>
+      </w:r>
+      <w:r>
+        <w:rPr>
+          <w:rFonts w:ascii="Calibri" w:hAnsi="Calibri" w:eastAsia="Calibri"/>
+          <w:b/>
+          <w:color w:val="2B2B2B"/>
+          <w:sz w:val="22"/>
+        </w:rPr>
+        <w:t>16 veterinarios</w:t>
+      </w:r>
+      <w:r>
+        <w:rPr>
+          <w:rFonts w:ascii="Calibri" w:hAnsi="Calibri" w:eastAsia="Calibri"/>
+          <w:b w:val="0"/>
+          <w:color w:val="2B2B2B"/>
+          <w:sz w:val="22"/>
+        </w:rPr>
+        <w:t xml:space="preserve">, sobre unas 5.000 mascotas de unos 2.000 dueños, y hoy lleva todo en </w:t>
+      </w:r>
+      <w:r>
+        <w:rPr>
+          <w:rFonts w:ascii="Calibri" w:hAnsi="Calibri" w:eastAsia="Calibri"/>
+          <w:b/>
+          <w:color w:val="2B2B2B"/>
+          <w:sz w:val="22"/>
+        </w:rPr>
+        <w:t>carpetas de papel</w:t>
+      </w:r>
+      <w:r>
+        <w:rPr>
+          <w:rFonts w:ascii="Calibri" w:hAnsi="Calibri" w:eastAsia="Calibri"/>
+          <w:b w:val="0"/>
+          <w:color w:val="2B2B2B"/>
+          <w:sz w:val="22"/>
+        </w:rPr>
+        <w:t>. La administración reporta tres problemas:</w:t>
+      </w:r>
+    </w:p>
+    <w:p>
+      <w:pPr>
+        <w:pStyle w:val="ListBullet"/>
+        <w:spacing w:after="40"/>
+      </w:pPr>
+      <w:r>
+        <w:rPr>
+          <w:rFonts w:ascii="Calibri" w:hAnsi="Calibri" w:eastAsia="Calibri"/>
+          <w:b w:val="0"/>
+          <w:color w:val="2B2B2B"/>
+          <w:sz w:val="22"/>
+        </w:rPr>
+        <w:t>Se extravían fichas de pacientes: el expediente existe en un solo papel.</w:t>
+      </w:r>
+    </w:p>
+    <w:p>
+      <w:pPr>
+        <w:pStyle w:val="ListBullet"/>
+        <w:spacing w:after="40"/>
+      </w:pPr>
+      <w:r>
+        <w:rPr>
+          <w:rFonts w:ascii="Calibri" w:hAnsi="Calibri" w:eastAsia="Calibri"/>
+          <w:b w:val="0"/>
+          <w:color w:val="2B2B2B"/>
+          <w:sz w:val="22"/>
+        </w:rPr>
+        <w:t>Buscar un historial en el archivo físico genera filas en la sala de espera.</w:t>
+      </w:r>
+    </w:p>
+    <w:p>
+      <w:pPr>
+        <w:pStyle w:val="ListBullet"/>
+        <w:spacing w:after="40"/>
+      </w:pPr>
+      <w:r>
+        <w:rPr>
+          <w:rFonts w:ascii="Calibri" w:hAnsi="Calibri" w:eastAsia="Calibri"/>
+          <w:b w:val="0"/>
+          <w:color w:val="2B2B2B"/>
+          <w:sz w:val="22"/>
+        </w:rPr>
+        <w:t>No hay métricas: no saben cuántas especies atienden al mes.</w:t>
+      </w:r>
+    </w:p>
+    <w:p>
+      <w:pPr>
+        <w:spacing w:after="120"/>
+      </w:pPr>
+      <w:r>
+        <w:rPr>
+          <w:rFonts w:ascii="Calibri" w:hAnsi="Calibri" w:eastAsia="Calibri"/>
+          <w:b w:val="0"/>
+          <w:color w:val="2B2B2B"/>
+          <w:sz w:val="22"/>
+        </w:rPr>
+        <w:t xml:space="preserve">Usted construye la </w:t>
+      </w:r>
+      <w:r>
+        <w:rPr>
+          <w:rFonts w:ascii="Calibri" w:hAnsi="Calibri" w:eastAsia="Calibri"/>
+          <w:b/>
+          <w:color w:val="2B2B2B"/>
+          <w:sz w:val="22"/>
+        </w:rPr>
+        <w:t>capa de datos</w:t>
+      </w:r>
+      <w:r>
+        <w:rPr>
+          <w:rFonts w:ascii="Calibri" w:hAnsi="Calibri" w:eastAsia="Calibri"/>
+          <w:b w:val="0"/>
+          <w:color w:val="2B2B2B"/>
+          <w:sz w:val="22"/>
+        </w:rPr>
+        <w:t xml:space="preserve"> de VetCare: el modelo, la integridad, la seguridad y el rendimiento. La aplicación no se pide en esta asignatura.</w:t>
+      </w:r>
+    </w:p>
+    <w:p>
+      <w:pPr>
+        <w:spacing w:after="120"/>
+        <w:shd w:val="clear" w:fill="E8F4FA"/>
+      </w:pPr>
+      <w:r>
+        <w:rPr>
+          <w:rFonts w:ascii="Calibri" w:hAnsi="Calibri" w:eastAsia="Calibri"/>
+          <w:b/>
+          <w:color w:val="2B2B2B"/>
+          <w:sz w:val="22"/>
+        </w:rPr>
+        <w:t>Caso completo (téngalo a mano todo el semestre):</w:t>
+      </w:r>
+      <w:r>
+        <w:rPr>
+          <w:rFonts w:ascii="Calibri" w:hAnsi="Calibri" w:eastAsia="Calibri"/>
+          <w:b w:val="0"/>
+          <w:color w:val="2B2B2B"/>
+          <w:sz w:val="22"/>
+        </w:rPr>
+        <w:t xml:space="preserve"> Clases/Proyecto Integrador/Anexo - Caso de estudio Clinica Huellitas — las 8 entidades, las 3 reglas de negocio, el elenco de nombres y cómo crece la base hasta las 30.010 citas que se optimizan en las Clases 6 y 7.</w:t>
       </w:r>
     </w:p>
     <w:p>

</xml_diff>